<commit_message>
Add full semester report with generated figure set
Co-authored-by: arena-agent <297053741+arena-agent@users.noreply.github.com>
</commit_message>
<xml_diff>
--- a/report/deliverables/BinGenie_What_We_Can_Use.docx
+++ b/report/deliverables/BinGenie_What_We_Can_Use.docx
@@ -623,7 +623,7 @@
                 <w:b w:val="0"/>
                 <w:sz w:val="14"/>
               </w:rPr>
-              <w:t>Keep, with a dimensioned 2×2 arrangement and the 112 mm centre radius shown (§4).</w:t>
+              <w:t>Keep, with the four cardinal positions on the 112 mm centre radius dimensioned (§4).</w:t>
             </w:r>
           </w:p>
         </w:tc>
@@ -5369,7 +5369,7 @@
           <w:i w:val="0"/>
           <w:sz w:val="22"/>
         </w:rPr>
-        <w:t>The dimensions in the old documents are correct but never assembled into a layout, which is why the 2.4 mm clearance problem went unnoticed. This is the layout they imply. Put it in the drawing and the report gains a level of detail that is unusual at this stage.</w:t>
+        <w:t>The dimensions in the old documents are correct but never assembled into a layout, which is why neither the 2.4 mm clearance problem nor the arrangement itself was ever checked. This is the layout they imply. Put it in the drawing and the report gains a level of detail that is unusual at this stage.</w:t>
       </w:r>
     </w:p>
     <w:tbl>
@@ -5689,7 +5689,7 @@
                 <w:b w:val="0"/>
                 <w:sz w:val="15"/>
               </w:rPr>
-              <w:t>2 × 2 cluster, 312 mm × 312 mm</w:t>
+              <w:t>Four at 90° (cardinal), centre radius 112 mm</w:t>
             </w:r>
           </w:p>
         </w:tc>
@@ -5709,7 +5709,7 @@
                 <w:b w:val="0"/>
                 <w:sz w:val="15"/>
               </w:rPr>
-              <w:t>4 × 156 = 624 mm will not fit a 450 mm body in one row</w:t>
+              <w:t>Each outer edge is flush with the disc rim. A 2×2 square cluster reaches 236 mm from the axis and cannot fit a Ø380 disc; four in a row need 624 mm in a 450 mm body.</w:t>
             </w:r>
           </w:p>
         </w:tc>

</xml_diff>